<commit_message>
Make the memo self-contained: embed surge + attrition charts
Add src/memo_figures.py (regenerates the two figures) and figures/*.png,
and embed them in memo.md (§1 monthly hires, §4b cumulative departures).
Regenerate memo.pdf and memo.docx with the images inline.

Co-Authored-By: Claude Opus 4.8 (1M context) <noreply@anthropic.com>
</commit_message>
<xml_diff>
--- a/memo.docx
+++ b/memo.docx
@@ -2,7 +2,7 @@
 <file path=word/document.xml><?xml version="1.0" encoding="utf-8"?>
 <w:document xmlns:w="http://schemas.openxmlformats.org/wordprocessingml/2006/main" xmlns:m="http://schemas.openxmlformats.org/officeDocument/2006/math" xmlns:r="http://schemas.openxmlformats.org/officeDocument/2006/relationships" xmlns:o="urn:schemas-microsoft-com:office:office" xmlns:v="urn:schemas-microsoft-com:vml" xmlns:w10="urn:schemas-microsoft-com:office:word" xmlns:a="http://schemas.openxmlformats.org/drawingml/2006/main" xmlns:pic="http://schemas.openxmlformats.org/drawingml/2006/picture" xmlns:wp="http://schemas.openxmlformats.org/drawingml/2006/wordprocessingDrawing">
   <w:body>
-    <w:bookmarkStart w:id="16" w:name="Xebc49d8b8a729a944bd628ff021a6bd1d02979b"/>
+    <w:bookmarkStart w:id="22" w:name="Xebc49d8b8a729a944bd628ff021a6bd1d02979b"/>
     <w:p>
       <w:pPr>
         <w:pStyle w:val="Heading1"/>
@@ -207,7 +207,7 @@
         </w:pict>
       </w:r>
     </w:p>
-    <w:bookmarkStart w:id="9" w:name="X3a7f28f273421f847b65419c33aafe14d1e3a8d"/>
+    <w:bookmarkStart w:id="12" w:name="X3a7f28f273421f847b65419c33aafe14d1e3a8d"/>
     <w:p>
       <w:pPr>
         <w:pStyle w:val="Heading3"/>
@@ -314,8 +314,63 @@
         <w:t xml:space="preserve">(2025 was about 1.2× its 2024 level); its ramp is smaller, later, and Border-Patrol-focused.</w:t>
       </w:r>
     </w:p>
-    <w:bookmarkEnd w:id="9"/>
-    <w:bookmarkStart w:id="10" w:name="X8534123b64bb15b28e953449e791669d57f247c"/>
+    <w:p>
+      <w:pPr>
+        <w:pStyle w:val="CaptionedFigure"/>
+      </w:pPr>
+      <w:r>
+        <w:drawing>
+          <wp:inline>
+            <wp:extent cx="5334000" cy="2210103"/>
+            <wp:effectExtent b="0" l="0" r="0" t="0"/>
+            <wp:docPr descr="Monthly new hires, ICE vs CBP — a sharp, brief ICE burst in Sept 2025–Jan 2026 (shaded); CBP barely moves." title="" id="10" name="Picture"/>
+            <a:graphic>
+              <a:graphicData uri="http://schemas.openxmlformats.org/drawingml/2006/picture">
+                <pic:pic>
+                  <pic:nvPicPr>
+                    <pic:cNvPr descr="figures/monthly_hires.png" id="11" name="Picture"/>
+                    <pic:cNvPicPr>
+                      <a:picLocks noChangeArrowheads="1" noChangeAspect="1"/>
+                    </pic:cNvPicPr>
+                  </pic:nvPicPr>
+                  <pic:blipFill>
+                    <a:blip r:embed="rId9"/>
+                    <a:stretch>
+                      <a:fillRect/>
+                    </a:stretch>
+                  </pic:blipFill>
+                  <pic:spPr bwMode="auto">
+                    <a:xfrm>
+                      <a:off x="0" y="0"/>
+                      <a:ext cx="5334000" cy="2210103"/>
+                    </a:xfrm>
+                    <a:prstGeom prst="rect">
+                      <a:avLst/>
+                    </a:prstGeom>
+                    <a:noFill/>
+                    <a:ln w="9525">
+                      <a:noFill/>
+                      <a:headEnd/>
+                      <a:tailEnd/>
+                    </a:ln>
+                  </pic:spPr>
+                </pic:pic>
+              </a:graphicData>
+            </a:graphic>
+          </wp:inline>
+        </w:drawing>
+      </w:r>
+    </w:p>
+    <w:p>
+      <w:pPr>
+        <w:pStyle w:val="ImageCaption"/>
+      </w:pPr>
+      <w:r>
+        <w:t xml:space="preserve">Monthly new hires, ICE vs CBP — a sharp, brief ICE burst in Sept 2025–Jan 2026 (shaded); CBP barely moves.</w:t>
+      </w:r>
+    </w:p>
+    <w:bookmarkEnd w:id="12"/>
+    <w:bookmarkStart w:id="13" w:name="X8534123b64bb15b28e953449e791669d57f247c"/>
     <w:p>
       <w:pPr>
         <w:pStyle w:val="Heading3"/>
@@ -416,8 +471,8 @@
         <w:t xml:space="preserve">(about 7,000–9,000 hires/year, the Bush-era Border Patrol expansion); and CBP’s most recent rapid entry-officer push, in 2019–21, lost nearly 30% of new hires within the first year (§4b).</w:t>
       </w:r>
     </w:p>
-    <w:bookmarkEnd w:id="10"/>
-    <w:bookmarkStart w:id="11" w:name="X7d00e68482a177394e3d560b1fdc14b309ff7f1"/>
+    <w:bookmarkEnd w:id="13"/>
+    <w:bookmarkStart w:id="14" w:name="X7d00e68482a177394e3d560b1fdc14b309ff7f1"/>
     <w:p>
       <w:pPr>
         <w:pStyle w:val="Heading3"/>
@@ -470,8 +525,8 @@
         <w:t xml:space="preserve">, even though some hiring continued. CBP rose gradually (63k→69k) with no reversal. So the ICE workforce is still far above its pre-surge level — up roughly 8,400 since August even after the slip — but the ~4% decline from January’s peak is real, and §§3–4 show it is the surge hires themselves leaving.</w:t>
       </w:r>
     </w:p>
-    <w:bookmarkEnd w:id="11"/>
-    <w:bookmarkStart w:id="12" w:name="X5a9af37b953859a4759fee75a243e39261952d5"/>
+    <w:bookmarkEnd w:id="14"/>
+    <w:bookmarkStart w:id="15" w:name="X5a9af37b953859a4759fee75a243e39261952d5"/>
     <w:p>
       <w:pPr>
         <w:pStyle w:val="Heading3"/>
@@ -676,8 +731,8 @@
         <w:t xml:space="preserve">the surge hires.</w:t>
       </w:r>
     </w:p>
-    <w:bookmarkEnd w:id="12"/>
-    <w:bookmarkStart w:id="13" w:name="X320eb4db3d5b66f6d906ac918edcbe4d24ba196"/>
+    <w:bookmarkEnd w:id="15"/>
+    <w:bookmarkStart w:id="16" w:name="X320eb4db3d5b66f6d906ac918edcbe4d24ba196"/>
     <w:p>
       <w:pPr>
         <w:pStyle w:val="Heading3"/>
@@ -765,8 +820,8 @@
         <w:t xml:space="preserve">(expired term appointments plus some probationary removals; the data lumps the two together).</w:t>
       </w:r>
     </w:p>
-    <w:bookmarkEnd w:id="13"/>
-    <w:bookmarkStart w:id="14" w:name="Xdccf2aa36cf2627798f423e2e83c579d6cd4018"/>
+    <w:bookmarkEnd w:id="16"/>
+    <w:bookmarkStart w:id="20" w:name="Xdccf2aa36cf2627798f423e2e83c579d6cd4018"/>
     <w:p>
       <w:pPr>
         <w:pStyle w:val="Heading3"/>
@@ -962,6 +1017,61 @@
       </w:r>
       <w:r>
         <w:t xml:space="preserve">rapid-hire Border Patrol classes lost across a full year. ICE’s early loss is already near the high end of that range, with its first year not yet complete.</w:t>
+      </w:r>
+    </w:p>
+    <w:p>
+      <w:pPr>
+        <w:pStyle w:val="CaptionedFigure"/>
+      </w:pPr>
+      <w:r>
+        <w:drawing>
+          <wp:inline>
+            <wp:extent cx="5334000" cy="2082597"/>
+            <wp:effectExtent b="0" l="0" r="0" t="0"/>
+            <wp:docPr descr="Cumulative share of the ~7,000 entry-officer surge hires who had separated, by month — about one in four within the first year, and still climbing." title="" id="18" name="Picture"/>
+            <a:graphic>
+              <a:graphicData uri="http://schemas.openxmlformats.org/drawingml/2006/picture">
+                <pic:pic>
+                  <pic:nvPicPr>
+                    <pic:cNvPr descr="figures/cohort_exited.png" id="19" name="Picture"/>
+                    <pic:cNvPicPr>
+                      <a:picLocks noChangeArrowheads="1" noChangeAspect="1"/>
+                    </pic:cNvPicPr>
+                  </pic:nvPicPr>
+                  <pic:blipFill>
+                    <a:blip r:embed="rId17"/>
+                    <a:stretch>
+                      <a:fillRect/>
+                    </a:stretch>
+                  </pic:blipFill>
+                  <pic:spPr bwMode="auto">
+                    <a:xfrm>
+                      <a:off x="0" y="0"/>
+                      <a:ext cx="5334000" cy="2082597"/>
+                    </a:xfrm>
+                    <a:prstGeom prst="rect">
+                      <a:avLst/>
+                    </a:prstGeom>
+                    <a:noFill/>
+                    <a:ln w="9525">
+                      <a:noFill/>
+                      <a:headEnd/>
+                      <a:tailEnd/>
+                    </a:ln>
+                  </pic:spPr>
+                </pic:pic>
+              </a:graphicData>
+            </a:graphic>
+          </wp:inline>
+        </w:drawing>
+      </w:r>
+    </w:p>
+    <w:p>
+      <w:pPr>
+        <w:pStyle w:val="ImageCaption"/>
+      </w:pPr>
+      <w:r>
+        <w:t xml:space="preserve">Cumulative share of the ~7,000 entry-officer surge hires who had separated, by month — about one in four within the first year, and still climbing.</w:t>
       </w:r>
     </w:p>
     <w:p>
@@ -971,8 +1081,8 @@
         </w:pict>
       </w:r>
     </w:p>
-    <w:bookmarkEnd w:id="14"/>
-    <w:bookmarkStart w:id="15" w:name="X5fc2f1b076a649d9edd4ae0bb0fb1709a181c88"/>
+    <w:bookmarkEnd w:id="20"/>
+    <w:bookmarkStart w:id="21" w:name="X5fc2f1b076a649d9edd4ae0bb0fb1709a181c88"/>
     <w:p>
       <w:pPr>
         <w:pStyle w:val="Heading3"/>
@@ -1395,8 +1505,8 @@
         <w:t xml:space="preserve">.</w:t>
       </w:r>
     </w:p>
-    <w:bookmarkEnd w:id="15"/>
-    <w:bookmarkEnd w:id="16"/>
+    <w:bookmarkEnd w:id="21"/>
+    <w:bookmarkEnd w:id="22"/>
     <w:sectPr>
       <w:footnotePr>
         <w:numRestart w:val="eachSect"/>

</xml_diff>

<commit_message>
Polish chart styling: validated blue/orange palette, higher-res export, end labels
Swaps ICE/CBP colors for the dataviz-skill-validated categorical pair (the old
orange fell below the 3:1 contrast floor), bumps export to 200 dpi, adds
white-ringed end-dot markers, and a direct 28% end-label on the cohort-exit
chart. Re-exports memo.pdf/memo.docx with the refreshed figures.

Co-Authored-By: Claude Sonnet 5 <noreply@anthropic.com>
Claude-Session: https://claude.ai/code/session_01GaBFe4W6opUBgwgS4Y518S
</commit_message>
<xml_diff>
--- a/memo.docx
+++ b/memo.docx
@@ -321,7 +321,7 @@
       <w:r>
         <w:drawing>
           <wp:inline>
-            <wp:extent cx="5334000" cy="2210103"/>
+            <wp:extent cx="5334000" cy="2211347"/>
             <wp:effectExtent b="0" l="0" r="0" t="0"/>
             <wp:docPr descr="Monthly new hires, ICE vs CBP — a sharp, brief ICE burst in Sept 2025–Jan 2026 (shaded); CBP barely moves." title="" id="10" name="Picture"/>
             <a:graphic>
@@ -342,7 +342,7 @@
                   <pic:spPr bwMode="auto">
                     <a:xfrm>
                       <a:off x="0" y="0"/>
-                      <a:ext cx="5334000" cy="2210103"/>
+                      <a:ext cx="5334000" cy="2211347"/>
                     </a:xfrm>
                     <a:prstGeom prst="rect">
                       <a:avLst/>
@@ -1042,7 +1042,7 @@
       <w:r>
         <w:drawing>
           <wp:inline>
-            <wp:extent cx="5334000" cy="2082597"/>
+            <wp:extent cx="5334000" cy="2083892"/>
             <wp:effectExtent b="0" l="0" r="0" t="0"/>
             <wp:docPr descr="Cumulative share of the ~7,200 entry-officer surge hires who had separated, by month — more than one in four within the first year, and still climbing." title="" id="18" name="Picture"/>
             <a:graphic>
@@ -1063,7 +1063,7 @@
                   <pic:spPr bwMode="auto">
                     <a:xfrm>
                       <a:off x="0" y="0"/>
-                      <a:ext cx="5334000" cy="2082597"/>
+                      <a:ext cx="5334000" cy="2083892"/>
                     </a:xfrm>
                     <a:prstGeom prst="rect">
                       <a:avLst/>

</xml_diff>